<commit_message>
test(corpus): rule documents for rows of exact height whose content is taller, and VML pictures
</commit_message>
<xml_diff>
--- a/tests/corpus/word-rules/E-table-row-exact-height.docx
+++ b/tests/corpus/word-rules/E-table-row-exact-height.docx
@@ -1,22 +1,22 @@
 
 <file path=word/document.xml><?xml version="1.0" encoding="utf-8"?>
-<w:document xmlns:w="http://schemas.openxmlformats.org/wordprocessingml/2006/main" xmlns:r="http://schemas.openxmlformats.org/officeDocument/2006/relationships">
+<w:document xmlns:w="http://schemas.openxmlformats.org/wordprocessingml/2006/main" xmlns:r="http://schemas.openxmlformats.org/officeDocument/2006/relationships" xmlns:v="urn:schemas-microsoft-com:vml" xmlns:o="urn:schemas-microsoft-com:office:office" xmlns:w10="urn:schemas-microsoft-com:office:word">
   <w:body>
     <w:p>
       <w:r>
-        <w:t xml:space="preserve">Case: row 2 is exactly 30 pt high and holds 5 lines</w:t>
+        <w:t xml:space="preserve">Case 01: row 2 is exactly 30 pt high and holds 5 lines</w:t>
       </w:r>
     </w:p>
     <w:tbl>
       <w:tblPr>
         <w:tblW w:w="9026" w:type="dxa"/>
         <w:tblBorders>
-          <w:top w:val="single" w:sz="48" w:space="0" w:color="000000"/>
-          <w:left w:val="single" w:sz="48" w:space="0" w:color="000000"/>
-          <w:bottom w:val="single" w:sz="48" w:space="0" w:color="000000"/>
-          <w:right w:val="single" w:sz="48" w:space="0" w:color="000000"/>
-          <w:insideH w:val="single" w:sz="48" w:space="0" w:color="000000"/>
-          <w:insideV w:val="single" w:sz="48" w:space="0" w:color="000000"/>
+          <w:top w:val="single" w:sz="12" w:space="0" w:color="000000"/>
+          <w:left w:val="single" w:sz="12" w:space="0" w:color="000000"/>
+          <w:bottom w:val="single" w:sz="12" w:space="0" w:color="000000"/>
+          <w:right w:val="single" w:sz="12" w:space="0" w:color="000000"/>
+          <w:insideH w:val="single" w:sz="12" w:space="0" w:color="000000"/>
+          <w:insideV w:val="single" w:sz="12" w:space="0" w:color="000000"/>
         </w:tblBorders>
         <w:tblLayout w:type="fixed"/>
         <w:tblCellMar>
@@ -122,6 +122,534 @@
         </w:tc>
       </w:tr>
     </w:tbl>
+    <w:p/>
+    <w:p>
+      <w:r>
+        <w:t xml:space="preserve">Case 02: row 2 is exactly 8 pt high and holds one line of 11 pt text</w:t>
+      </w:r>
+    </w:p>
+    <w:tbl>
+      <w:tblPr>
+        <w:tblW w:w="9026" w:type="dxa"/>
+        <w:tblBorders>
+          <w:top w:val="single" w:sz="12" w:space="0" w:color="000000"/>
+          <w:left w:val="single" w:sz="12" w:space="0" w:color="000000"/>
+          <w:bottom w:val="single" w:sz="12" w:space="0" w:color="000000"/>
+          <w:right w:val="single" w:sz="12" w:space="0" w:color="000000"/>
+          <w:insideH w:val="single" w:sz="12" w:space="0" w:color="000000"/>
+          <w:insideV w:val="single" w:sz="12" w:space="0" w:color="000000"/>
+        </w:tblBorders>
+        <w:tblLayout w:type="fixed"/>
+        <w:tblCellMar>
+          <w:left w:w="108" w:type="dxa"/>
+          <w:right w:w="108" w:type="dxa"/>
+        </w:tblCellMar>
+      </w:tblPr>
+      <w:tblGrid>
+        <w:gridCol w:w="3008"/>
+        <w:gridCol w:w="3008"/>
+        <w:gridCol w:w="3008"/>
+      </w:tblGrid>
+      <w:tr>
+        <w:tc>
+          <w:p>
+            <w:r>
+              <w:t xml:space="preserve">r1c1</w:t>
+            </w:r>
+          </w:p>
+        </w:tc>
+        <w:tc>
+          <w:p>
+            <w:r>
+              <w:t xml:space="preserve">r1c2</w:t>
+            </w:r>
+          </w:p>
+        </w:tc>
+        <w:tc>
+          <w:p>
+            <w:r>
+              <w:t xml:space="preserve">r1c3</w:t>
+            </w:r>
+          </w:p>
+        </w:tc>
+      </w:tr>
+      <w:tr>
+        <w:trPr>
+          <w:trHeight w:val="160" w:hRule="exact"/>
+        </w:trPr>
+        <w:tc>
+          <w:p>
+            <w:r>
+              <w:t xml:space="preserve">Small row</w:t>
+            </w:r>
+          </w:p>
+        </w:tc>
+        <w:tc>
+          <w:p>
+            <w:r>
+              <w:t xml:space="preserve">r2c2</w:t>
+            </w:r>
+          </w:p>
+        </w:tc>
+        <w:tc>
+          <w:p>
+            <w:r>
+              <w:t xml:space="preserve">r2c3</w:t>
+            </w:r>
+          </w:p>
+        </w:tc>
+      </w:tr>
+      <w:tr>
+        <w:tc>
+          <w:p>
+            <w:r>
+              <w:t xml:space="preserve">r3c1</w:t>
+            </w:r>
+          </w:p>
+        </w:tc>
+        <w:tc>
+          <w:p>
+            <w:r>
+              <w:t xml:space="preserve">r3c2</w:t>
+            </w:r>
+          </w:p>
+        </w:tc>
+        <w:tc>
+          <w:p>
+            <w:r>
+              <w:t xml:space="preserve">r3c3</w:t>
+            </w:r>
+          </w:p>
+        </w:tc>
+      </w:tr>
+    </w:tbl>
+    <w:p/>
+    <w:p>
+      <w:r>
+        <w:t xml:space="preserve">Case 03: row 2 is exactly 20 pt high and holds 28 pt text</w:t>
+      </w:r>
+    </w:p>
+    <w:tbl>
+      <w:tblPr>
+        <w:tblW w:w="9026" w:type="dxa"/>
+        <w:tblBorders>
+          <w:top w:val="single" w:sz="12" w:space="0" w:color="000000"/>
+          <w:left w:val="single" w:sz="12" w:space="0" w:color="000000"/>
+          <w:bottom w:val="single" w:sz="12" w:space="0" w:color="000000"/>
+          <w:right w:val="single" w:sz="12" w:space="0" w:color="000000"/>
+          <w:insideH w:val="single" w:sz="12" w:space="0" w:color="000000"/>
+          <w:insideV w:val="single" w:sz="12" w:space="0" w:color="000000"/>
+        </w:tblBorders>
+        <w:tblLayout w:type="fixed"/>
+        <w:tblCellMar>
+          <w:left w:w="108" w:type="dxa"/>
+          <w:right w:w="108" w:type="dxa"/>
+        </w:tblCellMar>
+      </w:tblPr>
+      <w:tblGrid>
+        <w:gridCol w:w="3008"/>
+        <w:gridCol w:w="3008"/>
+        <w:gridCol w:w="3008"/>
+      </w:tblGrid>
+      <w:tr>
+        <w:tc>
+          <w:p>
+            <w:r>
+              <w:t xml:space="preserve">r1c1</w:t>
+            </w:r>
+          </w:p>
+        </w:tc>
+        <w:tc>
+          <w:p>
+            <w:r>
+              <w:t xml:space="preserve">r1c2</w:t>
+            </w:r>
+          </w:p>
+        </w:tc>
+        <w:tc>
+          <w:p>
+            <w:r>
+              <w:t xml:space="preserve">r1c3</w:t>
+            </w:r>
+          </w:p>
+        </w:tc>
+      </w:tr>
+      <w:tr>
+        <w:trPr>
+          <w:trHeight w:val="400" w:hRule="exact"/>
+        </w:trPr>
+        <w:tc>
+          <w:p>
+            <w:r>
+              <w:rPr>
+                <w:sz w:val="56"/>
+                <w:szCs w:val="56"/>
+              </w:rPr>
+              <w:t xml:space="preserve">Large text</w:t>
+            </w:r>
+          </w:p>
+        </w:tc>
+        <w:tc>
+          <w:p>
+            <w:r>
+              <w:t xml:space="preserve">r2c2</w:t>
+            </w:r>
+          </w:p>
+        </w:tc>
+        <w:tc>
+          <w:p>
+            <w:r>
+              <w:t xml:space="preserve">r2c3</w:t>
+            </w:r>
+          </w:p>
+        </w:tc>
+      </w:tr>
+      <w:tr>
+        <w:tc>
+          <w:p>
+            <w:r>
+              <w:t xml:space="preserve">r3c1</w:t>
+            </w:r>
+          </w:p>
+        </w:tc>
+        <w:tc>
+          <w:p>
+            <w:r>
+              <w:t xml:space="preserve">r3c2</w:t>
+            </w:r>
+          </w:p>
+        </w:tc>
+        <w:tc>
+          <w:p>
+            <w:r>
+              <w:t xml:space="preserve">r3c3</w:t>
+            </w:r>
+          </w:p>
+        </w:tc>
+      </w:tr>
+    </w:tbl>
+    <w:p/>
+    <w:p>
+      <w:r>
+        <w:t xml:space="preserve">Case 04: the same, the cell centred vertically (w:vAlign center)</w:t>
+      </w:r>
+    </w:p>
+    <w:tbl>
+      <w:tblPr>
+        <w:tblW w:w="9026" w:type="dxa"/>
+        <w:tblBorders>
+          <w:top w:val="single" w:sz="12" w:space="0" w:color="000000"/>
+          <w:left w:val="single" w:sz="12" w:space="0" w:color="000000"/>
+          <w:bottom w:val="single" w:sz="12" w:space="0" w:color="000000"/>
+          <w:right w:val="single" w:sz="12" w:space="0" w:color="000000"/>
+          <w:insideH w:val="single" w:sz="12" w:space="0" w:color="000000"/>
+          <w:insideV w:val="single" w:sz="12" w:space="0" w:color="000000"/>
+        </w:tblBorders>
+        <w:tblLayout w:type="fixed"/>
+        <w:tblCellMar>
+          <w:left w:w="108" w:type="dxa"/>
+          <w:right w:w="108" w:type="dxa"/>
+        </w:tblCellMar>
+      </w:tblPr>
+      <w:tblGrid>
+        <w:gridCol w:w="3008"/>
+        <w:gridCol w:w="3008"/>
+        <w:gridCol w:w="3008"/>
+      </w:tblGrid>
+      <w:tr>
+        <w:tc>
+          <w:p>
+            <w:r>
+              <w:t xml:space="preserve">r1c1</w:t>
+            </w:r>
+          </w:p>
+        </w:tc>
+        <w:tc>
+          <w:p>
+            <w:r>
+              <w:t xml:space="preserve">r1c2</w:t>
+            </w:r>
+          </w:p>
+        </w:tc>
+        <w:tc>
+          <w:p>
+            <w:r>
+              <w:t xml:space="preserve">r1c3</w:t>
+            </w:r>
+          </w:p>
+        </w:tc>
+      </w:tr>
+      <w:tr>
+        <w:trPr>
+          <w:trHeight w:val="400" w:hRule="exact"/>
+        </w:trPr>
+        <w:tc>
+          <w:tcPr>
+            <w:vAlign w:val="center"/>
+          </w:tcPr>
+          <w:p>
+            <w:r>
+              <w:rPr>
+                <w:sz w:val="56"/>
+                <w:szCs w:val="56"/>
+              </w:rPr>
+              <w:t xml:space="preserve">Large text</w:t>
+            </w:r>
+          </w:p>
+        </w:tc>
+        <w:tc>
+          <w:p>
+            <w:r>
+              <w:t xml:space="preserve">r2c2</w:t>
+            </w:r>
+          </w:p>
+        </w:tc>
+        <w:tc>
+          <w:p>
+            <w:r>
+              <w:t xml:space="preserve">r2c3</w:t>
+            </w:r>
+          </w:p>
+        </w:tc>
+      </w:tr>
+      <w:tr>
+        <w:tc>
+          <w:p>
+            <w:r>
+              <w:t xml:space="preserve">r3c1</w:t>
+            </w:r>
+          </w:p>
+        </w:tc>
+        <w:tc>
+          <w:p>
+            <w:r>
+              <w:t xml:space="preserve">r3c2</w:t>
+            </w:r>
+          </w:p>
+        </w:tc>
+        <w:tc>
+          <w:p>
+            <w:r>
+              <w:t xml:space="preserve">r3c3</w:t>
+            </w:r>
+          </w:p>
+        </w:tc>
+      </w:tr>
+    </w:tbl>
+    <w:p/>
+    <w:p>
+      <w:r>
+        <w:t xml:space="preserve">Case 05: the same, the cell at the bottom (w:vAlign bottom)</w:t>
+      </w:r>
+    </w:p>
+    <w:tbl>
+      <w:tblPr>
+        <w:tblW w:w="9026" w:type="dxa"/>
+        <w:tblBorders>
+          <w:top w:val="single" w:sz="12" w:space="0" w:color="000000"/>
+          <w:left w:val="single" w:sz="12" w:space="0" w:color="000000"/>
+          <w:bottom w:val="single" w:sz="12" w:space="0" w:color="000000"/>
+          <w:right w:val="single" w:sz="12" w:space="0" w:color="000000"/>
+          <w:insideH w:val="single" w:sz="12" w:space="0" w:color="000000"/>
+          <w:insideV w:val="single" w:sz="12" w:space="0" w:color="000000"/>
+        </w:tblBorders>
+        <w:tblLayout w:type="fixed"/>
+        <w:tblCellMar>
+          <w:left w:w="108" w:type="dxa"/>
+          <w:right w:w="108" w:type="dxa"/>
+        </w:tblCellMar>
+      </w:tblPr>
+      <w:tblGrid>
+        <w:gridCol w:w="3008"/>
+        <w:gridCol w:w="3008"/>
+        <w:gridCol w:w="3008"/>
+      </w:tblGrid>
+      <w:tr>
+        <w:tc>
+          <w:p>
+            <w:r>
+              <w:t xml:space="preserve">r1c1</w:t>
+            </w:r>
+          </w:p>
+        </w:tc>
+        <w:tc>
+          <w:p>
+            <w:r>
+              <w:t xml:space="preserve">r1c2</w:t>
+            </w:r>
+          </w:p>
+        </w:tc>
+        <w:tc>
+          <w:p>
+            <w:r>
+              <w:t xml:space="preserve">r1c3</w:t>
+            </w:r>
+          </w:p>
+        </w:tc>
+      </w:tr>
+      <w:tr>
+        <w:trPr>
+          <w:trHeight w:val="400" w:hRule="exact"/>
+        </w:trPr>
+        <w:tc>
+          <w:tcPr>
+            <w:vAlign w:val="bottom"/>
+          </w:tcPr>
+          <w:p>
+            <w:r>
+              <w:rPr>
+                <w:sz w:val="56"/>
+                <w:szCs w:val="56"/>
+              </w:rPr>
+              <w:t xml:space="preserve">Large text</w:t>
+            </w:r>
+          </w:p>
+        </w:tc>
+        <w:tc>
+          <w:p>
+            <w:r>
+              <w:t xml:space="preserve">r2c2</w:t>
+            </w:r>
+          </w:p>
+        </w:tc>
+        <w:tc>
+          <w:p>
+            <w:r>
+              <w:t xml:space="preserve">r2c3</w:t>
+            </w:r>
+          </w:p>
+        </w:tc>
+      </w:tr>
+      <w:tr>
+        <w:tc>
+          <w:p>
+            <w:r>
+              <w:t xml:space="preserve">r3c1</w:t>
+            </w:r>
+          </w:p>
+        </w:tc>
+        <w:tc>
+          <w:p>
+            <w:r>
+              <w:t xml:space="preserve">r3c2</w:t>
+            </w:r>
+          </w:p>
+        </w:tc>
+        <w:tc>
+          <w:p>
+            <w:r>
+              <w:t xml:space="preserve">r3c3</w:t>
+            </w:r>
+          </w:p>
+        </w:tc>
+      </w:tr>
+    </w:tbl>
+    <w:p/>
+    <w:p>
+      <w:r>
+        <w:t xml:space="preserve">Case 06: row 2 is exactly 20 pt high and holds an inline picture 60 pt tall</w:t>
+      </w:r>
+    </w:p>
+    <w:tbl>
+      <w:tblPr>
+        <w:tblW w:w="9026" w:type="dxa"/>
+        <w:tblBorders>
+          <w:top w:val="single" w:sz="12" w:space="0" w:color="000000"/>
+          <w:left w:val="single" w:sz="12" w:space="0" w:color="000000"/>
+          <w:bottom w:val="single" w:sz="12" w:space="0" w:color="000000"/>
+          <w:right w:val="single" w:sz="12" w:space="0" w:color="000000"/>
+          <w:insideH w:val="single" w:sz="12" w:space="0" w:color="000000"/>
+          <w:insideV w:val="single" w:sz="12" w:space="0" w:color="000000"/>
+        </w:tblBorders>
+        <w:tblLayout w:type="fixed"/>
+        <w:tblCellMar>
+          <w:left w:w="108" w:type="dxa"/>
+          <w:right w:w="108" w:type="dxa"/>
+        </w:tblCellMar>
+      </w:tblPr>
+      <w:tblGrid>
+        <w:gridCol w:w="3008"/>
+        <w:gridCol w:w="3008"/>
+        <w:gridCol w:w="3008"/>
+      </w:tblGrid>
+      <w:tr>
+        <w:tc>
+          <w:p>
+            <w:r>
+              <w:t xml:space="preserve">r1c1</w:t>
+            </w:r>
+          </w:p>
+        </w:tc>
+        <w:tc>
+          <w:p>
+            <w:r>
+              <w:t xml:space="preserve">r1c2</w:t>
+            </w:r>
+          </w:p>
+        </w:tc>
+        <w:tc>
+          <w:p>
+            <w:r>
+              <w:t xml:space="preserve">r1c3</w:t>
+            </w:r>
+          </w:p>
+        </w:tc>
+      </w:tr>
+      <w:tr>
+        <w:trPr>
+          <w:trHeight w:val="400" w:hRule="exact"/>
+        </w:trPr>
+        <w:tc>
+          <w:p>
+            <w:r>
+              <w:pict>
+                <v:shape id="p1" style="width:30pt;height:60pt" stroked="f">
+                  <v:imagedata r:id="rIdimage1" o:title=""/>
+                </v:shape>
+              </w:pict>
+            </w:r>
+          </w:p>
+        </w:tc>
+        <w:tc>
+          <w:p>
+            <w:r>
+              <w:t xml:space="preserve">r2c2</w:t>
+            </w:r>
+          </w:p>
+        </w:tc>
+        <w:tc>
+          <w:p>
+            <w:r>
+              <w:t xml:space="preserve">r2c3</w:t>
+            </w:r>
+          </w:p>
+        </w:tc>
+      </w:tr>
+      <w:tr>
+        <w:tc>
+          <w:p>
+            <w:r>
+              <w:t xml:space="preserve">r3c1</w:t>
+            </w:r>
+          </w:p>
+        </w:tc>
+        <w:tc>
+          <w:p>
+            <w:r>
+              <w:t xml:space="preserve">r3c2</w:t>
+            </w:r>
+          </w:p>
+        </w:tc>
+        <w:tc>
+          <w:p>
+            <w:r>
+              <w:t xml:space="preserve">r3c3</w:t>
+            </w:r>
+          </w:p>
+        </w:tc>
+      </w:tr>
+    </w:tbl>
+    <w:p/>
     <w:p>
       <w:r>
         <w:t xml:space="preserve">End of the document.</w:t>

</xml_diff>